<commit_message>
Fix pagination: keep headings, tables and pseudocode with their text; update cheat sheet page numbers
Co-Authored-By: Claude Sonnet 5.5 <noreply@anthropic.com>
Claude-Session: https://claude.ai/code/session_01Q1RoAMr7AGRCD4cuNgQnXj
</commit_message>
<xml_diff>
--- a/report/Final_Cheat_Sheet.docx
+++ b/report/Final_Cheat_Sheet.docx
@@ -29,7 +29,7 @@
           <w:sz w:val="17"/>
           <w:szCs w:val="17"/>
         </w:rPr>
-        <w:t xml:space="preserve">Pages refer to LexFront_Final_Report.docx (26 pages; check against your Word copy). Aim: 5 to 7 minutes.</w:t>
+        <w:t xml:space="preserve">Pages refer to LexFront_Final_Report.docx (27 pages; check against your Word copy). Aim: 5 to 7 minutes.</w:t>
       </w:r>
     </w:p>
     <w:p>
@@ -489,7 +489,7 @@
                 <w:sz w:val="18"/>
                 <w:szCs w:val="18"/>
               </w:rPr>
-              <w:t xml:space="preserve">p12</w:t>
+              <w:t xml:space="preserve">p12-13</w:t>
             </w:r>
           </w:p>
         </w:tc>
@@ -578,7 +578,7 @@
                 <w:sz w:val="18"/>
                 <w:szCs w:val="18"/>
               </w:rPr>
-              <w:t xml:space="preserve">p13</w:t>
+              <w:t xml:space="preserve">p13-14</w:t>
             </w:r>
           </w:p>
         </w:tc>
@@ -667,7 +667,7 @@
                 <w:sz w:val="18"/>
                 <w:szCs w:val="18"/>
               </w:rPr>
-              <w:t xml:space="preserve">p19</w:t>
+              <w:t xml:space="preserve">p20</w:t>
             </w:r>
           </w:p>
         </w:tc>
@@ -845,7 +845,7 @@
                 <w:sz w:val="18"/>
                 <w:szCs w:val="18"/>
               </w:rPr>
-              <w:t xml:space="preserve">p16-18</w:t>
+              <w:t xml:space="preserve">p17-19</w:t>
             </w:r>
           </w:p>
         </w:tc>
@@ -934,7 +934,7 @@
                 <w:sz w:val="18"/>
                 <w:szCs w:val="18"/>
               </w:rPr>
-              <w:t xml:space="preserve">p20</w:t>
+              <w:t xml:space="preserve">p21</w:t>
             </w:r>
           </w:p>
         </w:tc>
@@ -1023,7 +1023,7 @@
                 <w:sz w:val="18"/>
                 <w:szCs w:val="18"/>
               </w:rPr>
-              <w:t xml:space="preserve">p21</w:t>
+              <w:t xml:space="preserve">p22-23</w:t>
             </w:r>
           </w:p>
         </w:tc>
@@ -1206,7 +1206,7 @@
           <w:sz w:val="19"/>
           <w:szCs w:val="19"/>
         </w:rPr>
-        <w:t xml:space="preserve">full-data tables (quick numbers are a subsample). Close on p20 Fig 7 for large-scale results.</w:t>
+        <w:t xml:space="preserve">full-data tables (quick numbers are a subsample). Close on p21 Fig 7 for large-scale results.</w:t>
       </w:r>
     </w:p>
     <w:p>
@@ -1386,7 +1386,7 @@
           <w:sz w:val="19"/>
           <w:szCs w:val="19"/>
         </w:rPr>
-        <w:t xml:space="preserve">Limits (p22): </w:t>
+        <w:t xml:space="preserve">Limits (p23): </w:t>
       </w:r>
       <w:r>
         <w:rPr>

</xml_diff>

<commit_message>
Pagination: let long pseudocode and large tables flow across pages (removes large gaps from section 3.4 onward); update cheat sheet pages
Co-Authored-By: Claude Sonnet 5.5 <noreply@anthropic.com>
Claude-Session: https://claude.ai/code/session_01Q1RoAMr7AGRCD4cuNgQnXj
</commit_message>
<xml_diff>
--- a/report/Final_Cheat_Sheet.docx
+++ b/report/Final_Cheat_Sheet.docx
@@ -29,7 +29,7 @@
           <w:sz w:val="17"/>
           <w:szCs w:val="17"/>
         </w:rPr>
-        <w:t xml:space="preserve">Pages refer to LexFront_Final_Report.docx (27 pages; check against your Word copy). Aim: 5 to 7 minutes.</w:t>
+        <w:t xml:space="preserve">Pages refer to LexFront_Final_Report.docx (25 pages; check against your Word copy). Aim: 5 to 7 minutes.</w:t>
       </w:r>
     </w:p>
     <w:p>
@@ -489,7 +489,7 @@
                 <w:sz w:val="18"/>
                 <w:szCs w:val="18"/>
               </w:rPr>
-              <w:t xml:space="preserve">p12-13</w:t>
+              <w:t xml:space="preserve">p11-12</w:t>
             </w:r>
           </w:p>
         </w:tc>
@@ -578,7 +578,7 @@
                 <w:sz w:val="18"/>
                 <w:szCs w:val="18"/>
               </w:rPr>
-              <w:t xml:space="preserve">p13-14</w:t>
+              <w:t xml:space="preserve">p12-13</w:t>
             </w:r>
           </w:p>
         </w:tc>
@@ -667,7 +667,7 @@
                 <w:sz w:val="18"/>
                 <w:szCs w:val="18"/>
               </w:rPr>
-              <w:t xml:space="preserve">p20</w:t>
+              <w:t xml:space="preserve">p19</w:t>
             </w:r>
           </w:p>
         </w:tc>
@@ -756,7 +756,7 @@
                 <w:sz w:val="18"/>
                 <w:szCs w:val="18"/>
               </w:rPr>
-              <w:t xml:space="preserve">p14-15</w:t>
+              <w:t xml:space="preserve">p13-14</w:t>
             </w:r>
           </w:p>
         </w:tc>
@@ -845,7 +845,7 @@
                 <w:sz w:val="18"/>
                 <w:szCs w:val="18"/>
               </w:rPr>
-              <w:t xml:space="preserve">p17-19</w:t>
+              <w:t xml:space="preserve">p16-17</w:t>
             </w:r>
           </w:p>
         </w:tc>
@@ -934,7 +934,7 @@
                 <w:sz w:val="18"/>
                 <w:szCs w:val="18"/>
               </w:rPr>
-              <w:t xml:space="preserve">p21</w:t>
+              <w:t xml:space="preserve">p19</w:t>
             </w:r>
           </w:p>
         </w:tc>
@@ -1023,7 +1023,7 @@
                 <w:sz w:val="18"/>
                 <w:szCs w:val="18"/>
               </w:rPr>
-              <w:t xml:space="preserve">p22-23</w:t>
+              <w:t xml:space="preserve">p21</w:t>
             </w:r>
           </w:p>
         </w:tc>
@@ -1206,7 +1206,7 @@
           <w:sz w:val="19"/>
           <w:szCs w:val="19"/>
         </w:rPr>
-        <w:t xml:space="preserve">full-data tables (quick numbers are a subsample). Close on p21 Fig 7 for large-scale results.</w:t>
+        <w:t xml:space="preserve">full-data tables (quick numbers are a subsample). Close on p19 Fig 7 for large-scale results.</w:t>
       </w:r>
     </w:p>
     <w:p>
@@ -1386,7 +1386,7 @@
           <w:sz w:val="19"/>
           <w:szCs w:val="19"/>
         </w:rPr>
-        <w:t xml:space="preserve">Limits (p23): </w:t>
+        <w:t xml:space="preserve">Limits (p21): </w:t>
       </w:r>
       <w:r>
         <w:rPr>

</xml_diff>

<commit_message>
IEEE-style algorithm blocks, redesigned architecture figure, distinct colours for existing vs proposed in charts
Co-Authored-By: Claude Sonnet 5.5 <noreply@anthropic.com>
Claude-Session: https://claude.ai/code/session_01Q1RoAMr7AGRCD4cuNgQnXj
</commit_message>
<xml_diff>
--- a/report/Final_Cheat_Sheet.docx
+++ b/report/Final_Cheat_Sheet.docx
@@ -400,7 +400,7 @@
                 <w:sz w:val="18"/>
                 <w:szCs w:val="18"/>
               </w:rPr>
-              <w:t xml:space="preserve">p6</w:t>
+              <w:t xml:space="preserve">p6-7</w:t>
             </w:r>
           </w:p>
         </w:tc>
@@ -429,7 +429,7 @@
                 <w:sz w:val="18"/>
                 <w:szCs w:val="18"/>
               </w:rPr>
-              <w:t xml:space="preserve">Module 2 pseudocode</w:t>
+              <w:t xml:space="preserve">Algorithms 2, 3 (Module 2)</w:t>
             </w:r>
           </w:p>
         </w:tc>
@@ -756,7 +756,7 @@
                 <w:sz w:val="18"/>
                 <w:szCs w:val="18"/>
               </w:rPr>
-              <w:t xml:space="preserve">p13-14</w:t>
+              <w:t xml:space="preserve">p13-15</w:t>
             </w:r>
           </w:p>
         </w:tc>

</xml_diff>

<commit_message>
Highest-resolution figures: 600 dpi charts with SVG/PDF vector copies, soft icon-based architecture diagram (6400 px) and DFA drawn from the .dot source
Co-Authored-By: Claude Sonnet 5.5 <noreply@anthropic.com>
Claude-Session: https://claude.ai/code/session_01Q1RoAMr7AGRCD4cuNgQnXj
</commit_message>
<xml_diff>
--- a/report/Final_Cheat_Sheet.docx
+++ b/report/Final_Cheat_Sheet.docx
@@ -845,7 +845,7 @@
                 <w:sz w:val="18"/>
                 <w:szCs w:val="18"/>
               </w:rPr>
-              <w:t xml:space="preserve">p16-17</w:t>
+              <w:t xml:space="preserve">p16-18</w:t>
             </w:r>
           </w:p>
         </w:tc>
@@ -934,7 +934,7 @@
                 <w:sz w:val="18"/>
                 <w:szCs w:val="18"/>
               </w:rPr>
-              <w:t xml:space="preserve">p19</w:t>
+              <w:t xml:space="preserve">p20</w:t>
             </w:r>
           </w:p>
         </w:tc>
@@ -1206,7 +1206,7 @@
           <w:sz w:val="19"/>
           <w:szCs w:val="19"/>
         </w:rPr>
-        <w:t xml:space="preserve">full-data tables (quick numbers are a subsample). Close on p19 Fig 7 for large-scale results.</w:t>
+        <w:t xml:space="preserve">full-data tables (quick numbers are a subsample). Close on p20 Fig 7 for large-scale results.</w:t>
       </w:r>
     </w:p>
     <w:p>
@@ -1386,7 +1386,7 @@
           <w:sz w:val="19"/>
           <w:szCs w:val="19"/>
         </w:rPr>
-        <w:t xml:space="preserve">Limits (p21): </w:t>
+        <w:t xml:space="preserve">Limits (p22): </w:t>
       </w:r>
       <w:r>
         <w:rPr>

</xml_diff>